<commit_message>
@meta: backfill round 2 — classifier accuracy + KB early-2026 schedule
- KB docx schedule: added Jan-Apr 2026 events (15 rows; was starting Apr 24 —
  'Concord?'/'Texas?' were answered 'not in 2026' though we WERE there Feb-Mar)
- State mention with only PAST in-state events → honest 'we already hit {state}
  this year: {cities}' reply (new _STATE_PAST_TEMPLATES)
- Place-capture stopwords: im/year/see/dont etc ('Im Washington'→'Year Im',
  'don't see Fort Worth'→'See Fort Worth')
- _prettify_place: dropped 'st '/'el ' prefixes ('stockton'→'St Ockton')
- Trailing state token stripped ('Austin Tx', 'Seattle wa')
- Non-place component words rejected ('Makeup Show With Beans')
- Influencer/collab inquiries → Bucket B (was getting brands-list FAQ reply)
- Stale 'interested' comments on old posts w/ unparseable dates → SKIP
- Backfill: 39 replies sent total (11 on DaOl9gix47k + 28 across 2026 posts),
  all comments marked handled
</commit_message>
<xml_diff>
--- a/scripts/data/meta_inbox_kb.docx
+++ b/scripts/data/meta_inbox_kb.docx
@@ -2223,6 +2223,336 @@
           <w:p>
             <w:r>
               <w:t>Anaheim, CA</w:t>
+            </w:r>
+          </w:p>
+        </w:tc>
+      </w:tr>
+      <w:tr>
+        <w:tc>
+          <w:tcPr>
+            <w:tcW w:type="dxa" w:w="2800"/>
+          </w:tcPr>
+          <w:p>
+            <w:r>
+              <w:t>Jan 9–11</w:t>
+            </w:r>
+          </w:p>
+        </w:tc>
+        <w:tc>
+          <w:tcPr>
+            <w:tcW w:type="dxa" w:w="6560"/>
+          </w:tcPr>
+          <w:p>
+            <w:r>
+              <w:t>Glendale, AZ</w:t>
+            </w:r>
+          </w:p>
+        </w:tc>
+      </w:tr>
+      <w:tr>
+        <w:tc>
+          <w:tcPr>
+            <w:tcW w:type="dxa" w:w="2800"/>
+          </w:tcPr>
+          <w:p>
+            <w:r>
+              <w:t>Jan 16–18</w:t>
+            </w:r>
+          </w:p>
+        </w:tc>
+        <w:tc>
+          <w:tcPr>
+            <w:tcW w:type="dxa" w:w="6560"/>
+          </w:tcPr>
+          <w:p>
+            <w:r>
+              <w:t>Fresno, CA</w:t>
+            </w:r>
+          </w:p>
+        </w:tc>
+      </w:tr>
+      <w:tr>
+        <w:tc>
+          <w:tcPr>
+            <w:tcW w:type="dxa" w:w="2800"/>
+          </w:tcPr>
+          <w:p>
+            <w:r>
+              <w:t>Jan 23–25</w:t>
+            </w:r>
+          </w:p>
+        </w:tc>
+        <w:tc>
+          <w:tcPr>
+            <w:tcW w:type="dxa" w:w="6560"/>
+          </w:tcPr>
+          <w:p>
+            <w:r>
+              <w:t>El Cajon, CA</w:t>
+            </w:r>
+          </w:p>
+        </w:tc>
+      </w:tr>
+      <w:tr>
+        <w:tc>
+          <w:tcPr>
+            <w:tcW w:type="dxa" w:w="2800"/>
+          </w:tcPr>
+          <w:p>
+            <w:r>
+              <w:t>Jan 30–Feb 1</w:t>
+            </w:r>
+          </w:p>
+        </w:tc>
+        <w:tc>
+          <w:tcPr>
+            <w:tcW w:type="dxa" w:w="6560"/>
+          </w:tcPr>
+          <w:p>
+            <w:r>
+              <w:t>Emeryville, CA</w:t>
+            </w:r>
+          </w:p>
+        </w:tc>
+      </w:tr>
+      <w:tr>
+        <w:tc>
+          <w:tcPr>
+            <w:tcW w:type="dxa" w:w="2800"/>
+          </w:tcPr>
+          <w:p>
+            <w:r>
+              <w:t>Feb 6–8</w:t>
+            </w:r>
+          </w:p>
+        </w:tc>
+        <w:tc>
+          <w:tcPr>
+            <w:tcW w:type="dxa" w:w="6560"/>
+          </w:tcPr>
+          <w:p>
+            <w:r>
+              <w:t>Concord, CA</w:t>
+            </w:r>
+          </w:p>
+        </w:tc>
+      </w:tr>
+      <w:tr>
+        <w:tc>
+          <w:tcPr>
+            <w:tcW w:type="dxa" w:w="2800"/>
+          </w:tcPr>
+          <w:p>
+            <w:r>
+              <w:t>Feb 13–15</w:t>
+            </w:r>
+          </w:p>
+        </w:tc>
+        <w:tc>
+          <w:tcPr>
+            <w:tcW w:type="dxa" w:w="6560"/>
+          </w:tcPr>
+          <w:p>
+            <w:r>
+              <w:t>Burbank, CA</w:t>
+            </w:r>
+          </w:p>
+        </w:tc>
+      </w:tr>
+      <w:tr>
+        <w:tc>
+          <w:tcPr>
+            <w:tcW w:type="dxa" w:w="2800"/>
+          </w:tcPr>
+          <w:p>
+            <w:r>
+              <w:t>Feb 20–22</w:t>
+            </w:r>
+          </w:p>
+        </w:tc>
+        <w:tc>
+          <w:tcPr>
+            <w:tcW w:type="dxa" w:w="6560"/>
+          </w:tcPr>
+          <w:p>
+            <w:r>
+              <w:t>North Las Vegas, NV</w:t>
+            </w:r>
+          </w:p>
+        </w:tc>
+      </w:tr>
+      <w:tr>
+        <w:tc>
+          <w:tcPr>
+            <w:tcW w:type="dxa" w:w="2800"/>
+          </w:tcPr>
+          <w:p>
+            <w:r>
+              <w:t>Feb 27–Mar 1</w:t>
+            </w:r>
+          </w:p>
+        </w:tc>
+        <w:tc>
+          <w:tcPr>
+            <w:tcW w:type="dxa" w:w="6560"/>
+          </w:tcPr>
+          <w:p>
+            <w:r>
+              <w:t>Amarillo, TX</w:t>
+            </w:r>
+          </w:p>
+        </w:tc>
+      </w:tr>
+      <w:tr>
+        <w:tc>
+          <w:tcPr>
+            <w:tcW w:type="dxa" w:w="2800"/>
+          </w:tcPr>
+          <w:p>
+            <w:r>
+              <w:t>Mar 6–8</w:t>
+            </w:r>
+          </w:p>
+        </w:tc>
+        <w:tc>
+          <w:tcPr>
+            <w:tcW w:type="dxa" w:w="6560"/>
+          </w:tcPr>
+          <w:p>
+            <w:r>
+              <w:t>Garland, TX</w:t>
+            </w:r>
+          </w:p>
+        </w:tc>
+      </w:tr>
+      <w:tr>
+        <w:tc>
+          <w:tcPr>
+            <w:tcW w:type="dxa" w:w="2800"/>
+          </w:tcPr>
+          <w:p>
+            <w:r>
+              <w:t>Mar 13–15</w:t>
+            </w:r>
+          </w:p>
+        </w:tc>
+        <w:tc>
+          <w:tcPr>
+            <w:tcW w:type="dxa" w:w="6560"/>
+          </w:tcPr>
+          <w:p>
+            <w:r>
+              <w:t>Fort Worth, TX</w:t>
+            </w:r>
+          </w:p>
+        </w:tc>
+      </w:tr>
+      <w:tr>
+        <w:tc>
+          <w:tcPr>
+            <w:tcW w:type="dxa" w:w="2800"/>
+          </w:tcPr>
+          <w:p>
+            <w:r>
+              <w:t>Mar 20–22</w:t>
+            </w:r>
+          </w:p>
+        </w:tc>
+        <w:tc>
+          <w:tcPr>
+            <w:tcW w:type="dxa" w:w="6560"/>
+          </w:tcPr>
+          <w:p>
+            <w:r>
+              <w:t>Tulsa, OK</w:t>
+            </w:r>
+          </w:p>
+        </w:tc>
+      </w:tr>
+      <w:tr>
+        <w:tc>
+          <w:tcPr>
+            <w:tcW w:type="dxa" w:w="2800"/>
+          </w:tcPr>
+          <w:p>
+            <w:r>
+              <w:t>Mar 27–29</w:t>
+            </w:r>
+          </w:p>
+        </w:tc>
+        <w:tc>
+          <w:tcPr>
+            <w:tcW w:type="dxa" w:w="6560"/>
+          </w:tcPr>
+          <w:p>
+            <w:r>
+              <w:t>Hampton, VA</w:t>
+            </w:r>
+          </w:p>
+        </w:tc>
+      </w:tr>
+      <w:tr>
+        <w:tc>
+          <w:tcPr>
+            <w:tcW w:type="dxa" w:w="2800"/>
+          </w:tcPr>
+          <w:p>
+            <w:r>
+              <w:t>Apr 3–5</w:t>
+            </w:r>
+          </w:p>
+        </w:tc>
+        <w:tc>
+          <w:tcPr>
+            <w:tcW w:type="dxa" w:w="6560"/>
+          </w:tcPr>
+          <w:p>
+            <w:r>
+              <w:t>Syracuse, NY</w:t>
+            </w:r>
+          </w:p>
+        </w:tc>
+      </w:tr>
+      <w:tr>
+        <w:tc>
+          <w:tcPr>
+            <w:tcW w:type="dxa" w:w="2800"/>
+          </w:tcPr>
+          <w:p>
+            <w:r>
+              <w:t>Apr 10–12</w:t>
+            </w:r>
+          </w:p>
+        </w:tc>
+        <w:tc>
+          <w:tcPr>
+            <w:tcW w:type="dxa" w:w="6560"/>
+          </w:tcPr>
+          <w:p>
+            <w:r>
+              <w:t>Reading, PA</w:t>
+            </w:r>
+          </w:p>
+        </w:tc>
+      </w:tr>
+      <w:tr>
+        <w:tc>
+          <w:tcPr>
+            <w:tcW w:type="dxa" w:w="2800"/>
+          </w:tcPr>
+          <w:p>
+            <w:r>
+              <w:t>Apr 17–19</w:t>
+            </w:r>
+          </w:p>
+        </w:tc>
+        <w:tc>
+          <w:tcPr>
+            <w:tcW w:type="dxa" w:w="6560"/>
+          </w:tcPr>
+          <w:p>
+            <w:r>
+              <w:t>Columbus, OH</w:t>
             </w:r>
           </w:p>
         </w:tc>

</xml_diff>